<commit_message>
Ajout de la relation UTILISATEUR <-> EQUIPEMENT (et UTILISATEUR acquitte ALERTE)
Correction du modèle de données, qui n'exprimait pas la relation entre les
utilisateurs et les équipements :

- Relation « supervise » UTILISATEUR <-> EQUIPEMENT (plusieurs-à-plusieurs),
  résolue par une table associative 'responsabilite' (clé primaire composite)
- Relation « acquitte » UTILISATEUR -> ALERTE (1,n), via la clé étrangère
  'acquittee_par' dans la table alertes
- Mise à jour : MCD, MLD, diagramme de classes (PlantUML + PNG régénérés)
- schema.sql : colonne acquittee_par + FK, table responsabilite + affectations
- database.py : acquitter_alerte(utilisateur_id), fonctions d'affectation
  (affecter_equipement, get_equipements_utilisateur, get_responsables_equipement)
- app.py : trace l'utilisateur qui acquitte (session user_id)
- Mémoire (chap. 6 et 7) et doc MERISE mis à jour ; Word régénéré
- PowerPoint régénéré avec les diagrammes à jour
</commit_message>
<xml_diff>
--- a/memoire/memoire-projet-OPEN-MOISE.docx
+++ b/memoire/memoire-projet-OPEN-MOISE.docx
@@ -14273,6 +14273,92 @@
       <w:r>
         <w:t xml:space="preserve">(figure 6).</w:t>
       </w:r>
+      <w:r>
+        <w:t xml:space="preserve"> </w:t>
+      </w:r>
+      <w:r>
+        <w:t xml:space="preserve">Les associations expriment qu’un équipement</w:t>
+      </w:r>
+      <w:r>
+        <w:t xml:space="preserve"> </w:t>
+      </w:r>
+      <w:r>
+        <w:rPr>
+          <w:iCs/>
+          <w:i/>
+        </w:rPr>
+        <w:t xml:space="preserve">génère</w:t>
+      </w:r>
+      <w:r>
+        <w:t xml:space="preserve"> </w:t>
+      </w:r>
+      <w:r>
+        <w:t xml:space="preserve">des journaux et</w:t>
+      </w:r>
+      <w:r>
+        <w:t xml:space="preserve"> </w:t>
+      </w:r>
+      <w:r>
+        <w:rPr>
+          <w:iCs/>
+          <w:i/>
+        </w:rPr>
+        <w:t xml:space="preserve">déclenche</w:t>
+      </w:r>
+      <w:r>
+        <w:t xml:space="preserve"> </w:t>
+      </w:r>
+      <w:r>
+        <w:t xml:space="preserve">des alertes, qu’un</w:t>
+      </w:r>
+      <w:r>
+        <w:t xml:space="preserve"> </w:t>
+      </w:r>
+      <w:r>
+        <w:rPr>
+          <w:bCs/>
+          <w:b/>
+        </w:rPr>
+        <w:t xml:space="preserve">utilisateur</w:t>
+      </w:r>
+      <w:r>
+        <w:t xml:space="preserve"> </w:t>
+      </w:r>
+      <w:r>
+        <w:rPr>
+          <w:iCs/>
+          <w:i/>
+        </w:rPr>
+        <w:t xml:space="preserve">supervise</w:t>
+      </w:r>
+      <w:r>
+        <w:t xml:space="preserve"> </w:t>
+      </w:r>
+      <w:r>
+        <w:t xml:space="preserve">plusieurs équipements (relation</w:t>
+      </w:r>
+      <w:r>
+        <w:t xml:space="preserve"> </w:t>
+      </w:r>
+      <w:r>
+        <w:t xml:space="preserve">plusieurs-à-plusieurs) et</w:t>
+      </w:r>
+      <w:r>
+        <w:t xml:space="preserve"> </w:t>
+      </w:r>
+      <w:r>
+        <w:rPr>
+          <w:iCs/>
+          <w:i/>
+        </w:rPr>
+        <w:t xml:space="preserve">acquitte</w:t>
+      </w:r>
+      <w:r>
+        <w:t xml:space="preserve"> </w:t>
+      </w:r>
+      <w:r>
+        <w:t xml:space="preserve">plusieurs alertes (relation 1..n).</w:t>
+      </w:r>
     </w:p>
     <w:p>
       <w:pPr>
@@ -14597,7 +14683,7 @@
         <w:pStyle w:val="FirstParagraph"/>
       </w:pPr>
       <w:r>
-        <w:t xml:space="preserve">Le MCD décrit les entités et leurs associations : un</w:t>
+        <w:t xml:space="preserve">Le MCD décrit les entités et leurs associations (figure 9) : un</w:t>
       </w:r>
       <w:r>
         <w:t xml:space="preserve"> </w:t>
@@ -14671,39 +14757,103 @@
         <w:t xml:space="preserve"> </w:t>
       </w:r>
       <w:r>
-        <w:t xml:space="preserve">; les</w:t>
-      </w:r>
-      <w:r>
-        <w:t xml:space="preserve"> </w:t>
-      </w:r>
-      <w:r>
-        <w:rPr>
-          <w:bCs/>
-          <w:b/>
-        </w:rPr>
-        <w:t xml:space="preserve">utilisateurs</w:t>
-      </w:r>
-      <w:r>
-        <w:t xml:space="preserve"> </w:t>
-      </w:r>
-      <w:r>
-        <w:t xml:space="preserve">et les</w:t>
-      </w:r>
-      <w:r>
-        <w:t xml:space="preserve"> </w:t>
-      </w:r>
-      <w:r>
-        <w:rPr>
-          <w:bCs/>
-          <w:b/>
-        </w:rPr>
-        <w:t xml:space="preserve">statistiques</w:t>
-      </w:r>
-      <w:r>
-        <w:t xml:space="preserve"> </w:t>
-      </w:r>
-      <w:r>
-        <w:t xml:space="preserve">complètent le modèle (figure 9).</w:t>
+        <w:t xml:space="preserve">; un</w:t>
+      </w:r>
+      <w:r>
+        <w:t xml:space="preserve"> </w:t>
+      </w:r>
+      <w:r>
+        <w:rPr>
+          <w:bCs/>
+          <w:b/>
+        </w:rPr>
+        <w:t xml:space="preserve">utilisateur</w:t>
+      </w:r>
+      <w:r>
+        <w:t xml:space="preserve"> </w:t>
+      </w:r>
+      <w:r>
+        <w:rPr>
+          <w:iCs/>
+          <w:i/>
+        </w:rPr>
+        <w:t xml:space="preserve">supervise</w:t>
+      </w:r>
+      <w:r>
+        <w:t xml:space="preserve"> </w:t>
+      </w:r>
+      <w:r>
+        <w:t xml:space="preserve">plusieurs équipements — relation</w:t>
+      </w:r>
+      <w:r>
+        <w:t xml:space="preserve"> </w:t>
+      </w:r>
+      <w:r>
+        <w:rPr>
+          <w:bCs/>
+          <w:b/>
+        </w:rPr>
+        <w:t xml:space="preserve">plusieurs-à-plusieurs</w:t>
+      </w:r>
+      <w:r>
+        <w:t xml:space="preserve"> </w:t>
+      </w:r>
+      <w:r>
+        <w:t xml:space="preserve">(0,n)–(1,n) — et</w:t>
+      </w:r>
+      <w:r>
+        <w:t xml:space="preserve"> </w:t>
+      </w:r>
+      <w:r>
+        <w:rPr>
+          <w:iCs/>
+          <w:i/>
+        </w:rPr>
+        <w:t xml:space="preserve">acquitte</w:t>
+      </w:r>
+      <w:r>
+        <w:t xml:space="preserve"> </w:t>
+      </w:r>
+      <w:r>
+        <w:t xml:space="preserve">plusieurs</w:t>
+      </w:r>
+      <w:r>
+        <w:t xml:space="preserve"> </w:t>
+      </w:r>
+      <w:r>
+        <w:rPr>
+          <w:bCs/>
+          <w:b/>
+        </w:rPr>
+        <w:t xml:space="preserve">alertes</w:t>
+      </w:r>
+      <w:r>
+        <w:t xml:space="preserve"> </w:t>
+      </w:r>
+      <w:r>
+        <w:t xml:space="preserve">—</w:t>
+      </w:r>
+      <w:r>
+        <w:t xml:space="preserve"> </w:t>
+      </w:r>
+      <w:r>
+        <w:t xml:space="preserve">relation (1,n). La</w:t>
+      </w:r>
+      <w:r>
+        <w:t xml:space="preserve"> </w:t>
+      </w:r>
+      <w:r>
+        <w:rPr>
+          <w:bCs/>
+          <w:b/>
+        </w:rPr>
+        <w:t xml:space="preserve">statistique</w:t>
+      </w:r>
+      <w:r>
+        <w:t xml:space="preserve"> </w:t>
+      </w:r>
+      <w:r>
+        <w:t xml:space="preserve">complète le modèle.</w:t>
       </w:r>
     </w:p>
     <w:p>
@@ -14713,7 +14863,7 @@
       <w:r>
         <w:drawing>
           <wp:inline>
-            <wp:extent cx="5334000" cy="3106107"/>
+            <wp:extent cx="5207000" cy="6388100"/>
             <wp:effectExtent b="0" l="0" r="0" t="0"/>
             <wp:docPr descr="Figure 9 — Modèle Conceptuel de Données (MCD)" title="" id="116" name="Picture"/>
             <a:graphic>
@@ -14734,7 +14884,7 @@
                   <pic:spPr bwMode="auto">
                     <a:xfrm>
                       <a:off x="0" y="0"/>
-                      <a:ext cx="5334000" cy="3106107"/>
+                      <a:ext cx="5207000" cy="6388100"/>
                     </a:xfrm>
                     <a:prstGeom prst="rect">
                       <a:avLst/>
@@ -14776,29 +14926,43 @@
         <w:pStyle w:val="FirstParagraph"/>
       </w:pPr>
       <w:r>
-        <w:t xml:space="preserve">Le MLD traduit le MCD en</w:t>
-      </w:r>
-      <w:r>
-        <w:t xml:space="preserve"> </w:t>
-      </w:r>
-      <w:r>
-        <w:rPr>
-          <w:bCs/>
-          <w:b/>
-        </w:rPr>
-        <w:t xml:space="preserve">cinq tables relationnelles</w:t>
-      </w:r>
-      <w:r>
-        <w:t xml:space="preserve"> </w:t>
-      </w:r>
-      <w:r>
-        <w:t xml:space="preserve">avec clés primaires</w:t>
-      </w:r>
-      <w:r>
-        <w:t xml:space="preserve"> </w:t>
-      </w:r>
-      <w:r>
-        <w:t xml:space="preserve">(PK) et étrangères (FK) :</w:t>
+        <w:t xml:space="preserve">Le MLD traduit le MCD en tables relationnelles avec clés primaires (PK) et</w:t>
+      </w:r>
+      <w:r>
+        <w:t xml:space="preserve"> </w:t>
+      </w:r>
+      <w:r>
+        <w:t xml:space="preserve">étrangères (FK) — figure 10. La relation plusieurs-à-plusieurs « supervise » est,</w:t>
+      </w:r>
+      <w:r>
+        <w:t xml:space="preserve"> </w:t>
+      </w:r>
+      <w:r>
+        <w:t xml:space="preserve">conformément aux règles de transformation MERISE,</w:t>
+      </w:r>
+      <w:r>
+        <w:t xml:space="preserve"> </w:t>
+      </w:r>
+      <w:r>
+        <w:rPr>
+          <w:bCs/>
+          <w:b/>
+        </w:rPr>
+        <w:t xml:space="preserve">résolue par une table</w:t>
+      </w:r>
+      <w:r>
+        <w:rPr>
+          <w:bCs/>
+          <w:b/>
+        </w:rPr>
+        <w:t xml:space="preserve"> </w:t>
+      </w:r>
+      <w:r>
+        <w:rPr>
+          <w:bCs/>
+          <w:b/>
+        </w:rPr>
+        <w:t xml:space="preserve">associative</w:t>
       </w:r>
       <w:r>
         <w:t xml:space="preserve"> </w:t>
@@ -14807,6 +14971,37 @@
         <w:rPr>
           <w:rStyle w:val="VerbatimChar"/>
         </w:rPr>
+        <w:t xml:space="preserve">responsabilite</w:t>
+      </w:r>
+      <w:r>
+        <w:t xml:space="preserve"> </w:t>
+      </w:r>
+      <w:r>
+        <w:t xml:space="preserve">(clé primaire composite). On obtient ainsi</w:t>
+      </w:r>
+      <w:r>
+        <w:t xml:space="preserve"> </w:t>
+      </w:r>
+      <w:r>
+        <w:rPr>
+          <w:bCs/>
+          <w:b/>
+        </w:rPr>
+        <w:t xml:space="preserve">six tables</w:t>
+      </w:r>
+      <w:r>
+        <w:t xml:space="preserve"> </w:t>
+      </w:r>
+      <w:r>
+        <w:t xml:space="preserve">:</w:t>
+      </w:r>
+      <w:r>
+        <w:t xml:space="preserve"> </w:t>
+      </w:r>
+      <w:r>
+        <w:rPr>
+          <w:rStyle w:val="VerbatimChar"/>
+        </w:rPr>
         <w:t xml:space="preserve">utilisateurs</w:t>
       </w:r>
       <w:r>
@@ -14855,13 +15050,58 @@
         <w:rPr>
           <w:rStyle w:val="VerbatimChar"/>
         </w:rPr>
+        <w:t xml:space="preserve">responsabilite</w:t>
+      </w:r>
+      <w:r>
+        <w:t xml:space="preserve"> </w:t>
+      </w:r>
+      <w:r>
+        <w:t xml:space="preserve">et</w:t>
+      </w:r>
+      <w:r>
+        <w:t xml:space="preserve"> </w:t>
+      </w:r>
+      <w:r>
+        <w:rPr>
+          <w:rStyle w:val="VerbatimChar"/>
+        </w:rPr>
         <w:t xml:space="preserve">statistiques</w:t>
       </w:r>
       <w:r>
-        <w:t xml:space="preserve"> </w:t>
-      </w:r>
-      <w:r>
-        <w:t xml:space="preserve">(figure 10).</w:t>
+        <w:t xml:space="preserve">. La relation « acquitte » se matérialise par</w:t>
+      </w:r>
+      <w:r>
+        <w:t xml:space="preserve"> </w:t>
+      </w:r>
+      <w:r>
+        <w:t xml:space="preserve">la clé étrangère</w:t>
+      </w:r>
+      <w:r>
+        <w:t xml:space="preserve"> </w:t>
+      </w:r>
+      <w:r>
+        <w:rPr>
+          <w:rStyle w:val="VerbatimChar"/>
+        </w:rPr>
+        <w:t xml:space="preserve">acquittee_par</w:t>
+      </w:r>
+      <w:r>
+        <w:t xml:space="preserve"> </w:t>
+      </w:r>
+      <w:r>
+        <w:t xml:space="preserve">dans la table</w:t>
+      </w:r>
+      <w:r>
+        <w:t xml:space="preserve"> </w:t>
+      </w:r>
+      <w:r>
+        <w:rPr>
+          <w:rStyle w:val="VerbatimChar"/>
+        </w:rPr>
+        <w:t xml:space="preserve">alertes</w:t>
+      </w:r>
+      <w:r>
+        <w:t xml:space="preserve">.</w:t>
       </w:r>
     </w:p>
     <w:p>
@@ -14871,7 +15111,7 @@
       <w:r>
         <w:drawing>
           <wp:inline>
-            <wp:extent cx="5334000" cy="3279213"/>
+            <wp:extent cx="5334000" cy="3398841"/>
             <wp:effectExtent b="0" l="0" r="0" t="0"/>
             <wp:docPr descr="Figure 10 — Modèle Logique de Données (MLD)" title="" id="120" name="Picture"/>
             <a:graphic>
@@ -14892,7 +15132,7 @@
                   <pic:spPr bwMode="auto">
                     <a:xfrm>
                       <a:off x="0" y="0"/>
-                      <a:ext cx="5334000" cy="3279213"/>
+                      <a:ext cx="5334000" cy="3398841"/>
                     </a:xfrm>
                     <a:prstGeom prst="rect">
                       <a:avLst/>
@@ -18441,7 +18681,23 @@
         <w:t xml:space="preserve"> </w:t>
       </w:r>
       <w:r>
-        <w:t xml:space="preserve">comporte cinq tables :</w:t>
+        <w:t xml:space="preserve">comporte</w:t>
+      </w:r>
+      <w:r>
+        <w:t xml:space="preserve"> </w:t>
+      </w:r>
+      <w:r>
+        <w:rPr>
+          <w:bCs/>
+          <w:b/>
+        </w:rPr>
+        <w:t xml:space="preserve">six tables</w:t>
+      </w:r>
+      <w:r>
+        <w:t xml:space="preserve"> </w:t>
+      </w:r>
+      <w:r>
+        <w:t xml:space="preserve">:</w:t>
       </w:r>
     </w:p>
     <w:p>
@@ -18670,7 +18926,147 @@
         <w:t xml:space="preserve"> </w:t>
       </w:r>
       <w:r>
-        <w:t xml:space="preserve">alerte active du même type).</w:t>
+        <w:t xml:space="preserve">alerte active du même type) et trace, via</w:t>
+      </w:r>
+      <w:r>
+        <w:t xml:space="preserve"> </w:t>
+      </w:r>
+      <w:r>
+        <w:rPr>
+          <w:rStyle w:val="VerbatimChar"/>
+        </w:rPr>
+        <w:t xml:space="preserve">acquittee_par</w:t>
+      </w:r>
+      <w:r>
+        <w:t xml:space="preserve">, l’</w:t>
+      </w:r>
+      <w:r>
+        <w:rPr>
+          <w:bCs/>
+          <w:b/>
+        </w:rPr>
+        <w:t xml:space="preserve">utilisateur</w:t>
+      </w:r>
+      <w:r>
+        <w:t xml:space="preserve"> </w:t>
+      </w:r>
+      <w:r>
+        <w:t xml:space="preserve">qui a pris en charge l’alerte.</w:t>
+      </w:r>
+    </w:p>
+    <w:p>
+      <w:pPr>
+        <w:numPr>
+          <w:ilvl w:val="0"/>
+          <w:numId w:val="1011"/>
+        </w:numPr>
+        <w:pStyle w:val="Compact"/>
+      </w:pPr>
+      <w:r>
+        <w:rPr>
+          <w:rStyle w:val="VerbatimChar"/>
+          <w:bCs/>
+          <w:b/>
+        </w:rPr>
+        <w:t xml:space="preserve">responsabilite</w:t>
+      </w:r>
+      <w:r>
+        <w:t xml:space="preserve"> </w:t>
+      </w:r>
+      <w:r>
+        <w:t xml:space="preserve">: table associative reliant</w:t>
+      </w:r>
+      <w:r>
+        <w:t xml:space="preserve"> </w:t>
+      </w:r>
+      <w:r>
+        <w:rPr>
+          <w:rStyle w:val="VerbatimChar"/>
+        </w:rPr>
+        <w:t xml:space="preserve">utilisateurs</w:t>
+      </w:r>
+      <w:r>
+        <w:t xml:space="preserve"> </w:t>
+      </w:r>
+      <w:r>
+        <w:t xml:space="preserve">et</w:t>
+      </w:r>
+      <w:r>
+        <w:t xml:space="preserve"> </w:t>
+      </w:r>
+      <w:r>
+        <w:rPr>
+          <w:rStyle w:val="VerbatimChar"/>
+        </w:rPr>
+        <w:t xml:space="preserve">equipements</w:t>
+      </w:r>
+      <w:r>
+        <w:t xml:space="preserve">. Elle matérialise la relation</w:t>
+      </w:r>
+      <w:r>
+        <w:t xml:space="preserve"> </w:t>
+      </w:r>
+      <w:r>
+        <w:rPr>
+          <w:bCs/>
+          <w:b/>
+        </w:rPr>
+        <w:t xml:space="preserve">« supervise »</w:t>
+      </w:r>
+      <w:r>
+        <w:t xml:space="preserve"> </w:t>
+      </w:r>
+      <w:r>
+        <w:t xml:space="preserve">(plusieurs-à-plusieurs) : un technicien est responsable de plusieurs</w:t>
+      </w:r>
+      <w:r>
+        <w:t xml:space="preserve"> </w:t>
+      </w:r>
+      <w:r>
+        <w:t xml:space="preserve">équipements, et un équipement peut être suivi par plusieurs techniciens. Sa</w:t>
+      </w:r>
+      <w:r>
+        <w:t xml:space="preserve"> </w:t>
+      </w:r>
+      <w:r>
+        <w:t xml:space="preserve">clé primaire est</w:t>
+      </w:r>
+      <w:r>
+        <w:t xml:space="preserve"> </w:t>
+      </w:r>
+      <w:r>
+        <w:rPr>
+          <w:bCs/>
+          <w:b/>
+        </w:rPr>
+        <w:t xml:space="preserve">composite</w:t>
+      </w:r>
+      <w:r>
+        <w:t xml:space="preserve"> </w:t>
+      </w:r>
+      <w:r>
+        <w:t xml:space="preserve">(</w:t>
+      </w:r>
+      <w:r>
+        <w:rPr>
+          <w:rStyle w:val="VerbatimChar"/>
+        </w:rPr>
+        <w:t xml:space="preserve">utilisateur_id</w:t>
+      </w:r>
+      <w:r>
+        <w:t xml:space="preserve">,</w:t>
+      </w:r>
+      <w:r>
+        <w:t xml:space="preserve"> </w:t>
+      </w:r>
+      <w:r>
+        <w:rPr>
+          <w:rStyle w:val="VerbatimChar"/>
+        </w:rPr>
+        <w:t xml:space="preserve">equipement_id</w:t>
+      </w:r>
+      <w:r>
+        <w:t xml:space="preserve">).</w:t>
       </w:r>
     </w:p>
     <w:p>

</xml_diff>

<commit_message>
Cohérence : mise à jour des mentions '5 tables' -> '6 tables' (table responsabilite)
Suite à l'ajout de la relation utilisateur-équipement :
- PowerPoint (générateur + .pptx) : faisabilité, diapo MERISE et annexe MLD
  passent à 6 tables et citent la table associative 'responsabilite'
- presentation-projet.md : liste des tables complétée
- Mémoire-projet (annexe C) et mémoire académique : 'cinq tables' -> 'six tables'
- Diagrammes (MCD, MLD, classes) déjà à jour et ré-embarqués
Documents Word et PowerPoint régénérés.
</commit_message>
<xml_diff>
--- a/memoire/memoire-projet-OPEN-MOISE.docx
+++ b/memoire/memoire-projet-OPEN-MOISE.docx
@@ -25374,7 +25374,25 @@
         <w:t xml:space="preserve">database/schema.sql</w:t>
       </w:r>
       <w:r>
-        <w:t xml:space="preserve">) : création de la base, des cinq tables, des contraintes,</w:t>
+        <w:t xml:space="preserve">) : création de la base, des six tables (dont la table</w:t>
+      </w:r>
+      <w:r>
+        <w:t xml:space="preserve"> </w:t>
+      </w:r>
+      <w:r>
+        <w:t xml:space="preserve">associative</w:t>
+      </w:r>
+      <w:r>
+        <w:t xml:space="preserve"> </w:t>
+      </w:r>
+      <w:r>
+        <w:rPr>
+          <w:rStyle w:val="VerbatimChar"/>
+        </w:rPr>
+        <w:t xml:space="preserve">responsabilite</w:t>
+      </w:r>
+      <w:r>
+        <w:t xml:space="preserve">), des contraintes,</w:t>
       </w:r>
       <w:r>
         <w:t xml:space="preserve"> </w:t>

</xml_diff>